<commit_message>
changes: alteracao dos modelos
</commit_message>
<xml_diff>
--- a/modelos/DECLARAÇÃO OFICIAL - TRANSFERÊNCIA.docx
+++ b/modelos/DECLARAÇÃO OFICIAL - TRANSFERÊNCIA.docx
@@ -1,6 +1,6 @@
 
 <file path=word/document.xml><?xml version="1.0" encoding="utf-8"?>
-<w:document xmlns:wpc="http://schemas.microsoft.com/office/word/2010/wordprocessingCanvas" xmlns:cx="http://schemas.microsoft.com/office/drawing/2014/chartex" xmlns:cx1="http://schemas.microsoft.com/office/drawing/2015/9/8/chartex" xmlns:cx2="http://schemas.microsoft.com/office/drawing/2015/10/21/chartex" xmlns:cx3="http://schemas.microsoft.com/office/drawing/2016/5/9/chartex" xmlns:cx4="http://schemas.microsoft.com/office/drawing/2016/5/10/chartex" xmlns:cx5="http://schemas.microsoft.com/office/drawing/2016/5/11/chartex" xmlns:cx6="http://schemas.microsoft.com/office/drawing/2016/5/12/chartex" xmlns:cx7="http://schemas.microsoft.com/office/drawing/2016/5/13/chartex" xmlns:cx8="http://schemas.microsoft.com/office/drawing/2016/5/14/chartex" xmlns:mc="http://schemas.openxmlformats.org/markup-compatibility/2006" xmlns:aink="http://schemas.microsoft.com/office/drawing/2016/ink" xmlns:am3d="http://schemas.microsoft.com/office/drawing/2017/model3d" xmlns:o="urn:schemas-microsoft-com:office:office" xmlns:oel="http://schemas.microsoft.com/office/2019/extlst" xmlns:r="http://schemas.openxmlformats.org/officeDocument/2006/relationships" xmlns:m="http://schemas.openxmlformats.org/officeDocument/2006/math" xmlns:v="urn:schemas-microsoft-com:vml" xmlns:wp14="http://schemas.microsoft.com/office/word/2010/wordprocessingDrawing" xmlns:wp="http://schemas.openxmlformats.org/drawingml/2006/wordprocessingDrawing" xmlns:w10="urn:schemas-microsoft-com:office:word" xmlns:w="http://schemas.openxmlformats.org/wordprocessingml/2006/main" xmlns:w14="http://schemas.microsoft.com/office/word/2010/wordml" xmlns:w15="http://schemas.microsoft.com/office/word/2012/wordml" xmlns:w16cex="http://schemas.microsoft.com/office/word/2018/wordml/cex" xmlns:w16cid="http://schemas.microsoft.com/office/word/2016/wordml/cid" xmlns:w16="http://schemas.microsoft.com/office/word/2018/wordml" xmlns:w16du="http://schemas.microsoft.com/office/word/2023/wordml/word16du" xmlns:w16sdtdh="http://schemas.microsoft.com/office/word/2020/wordml/sdtdatahash" xmlns:w16sdtfl="http://schemas.microsoft.com/office/word/2024/wordml/sdtformatlock" xmlns:w16se="http://schemas.microsoft.com/office/word/2015/wordml/symex" xmlns:wpg="http://schemas.microsoft.com/office/word/2010/wordprocessingGroup" xmlns:wpi="http://schemas.microsoft.com/office/word/2010/wordprocessingInk" xmlns:wne="http://schemas.microsoft.com/office/word/2006/wordml" xmlns:wps="http://schemas.microsoft.com/office/word/2010/wordprocessingShape" mc:Ignorable="w14 w15 w16se w16cid w16 w16cex w16sdtdh w16sdtfl w16du wp14">
+<w:document xmlns:wpc="http://schemas.microsoft.com/office/word/2010/wordprocessingCanvas" xmlns:cx="http://schemas.microsoft.com/office/drawing/2014/chartex" xmlns:cx1="http://schemas.microsoft.com/office/drawing/2015/9/8/chartex" xmlns:cx2="http://schemas.microsoft.com/office/drawing/2015/10/21/chartex" xmlns:cx3="http://schemas.microsoft.com/office/drawing/2016/5/9/chartex" xmlns:cx4="http://schemas.microsoft.com/office/drawing/2016/5/10/chartex" xmlns:cx5="http://schemas.microsoft.com/office/drawing/2016/5/11/chartex" xmlns:cx6="http://schemas.microsoft.com/office/drawing/2016/5/12/chartex" xmlns:cx7="http://schemas.microsoft.com/office/drawing/2016/5/13/chartex" xmlns:cx8="http://schemas.microsoft.com/office/drawing/2016/5/14/chartex" xmlns:mc="http://schemas.openxmlformats.org/markup-compatibility/2006" xmlns:aink="http://schemas.microsoft.com/office/drawing/2016/ink" xmlns:am3d="http://schemas.microsoft.com/office/drawing/2017/model3d" xmlns:o="urn:schemas-microsoft-com:office:office" xmlns:r="http://schemas.openxmlformats.org/officeDocument/2006/relationships" xmlns:m="http://schemas.openxmlformats.org/officeDocument/2006/math" xmlns:v="urn:schemas-microsoft-com:vml" xmlns:wp14="http://schemas.microsoft.com/office/word/2010/wordprocessingDrawing" xmlns:wp="http://schemas.openxmlformats.org/drawingml/2006/wordprocessingDrawing" xmlns:w10="urn:schemas-microsoft-com:office:word" xmlns:w="http://schemas.openxmlformats.org/wordprocessingml/2006/main" xmlns:w14="http://schemas.microsoft.com/office/word/2010/wordml" xmlns:w15="http://schemas.microsoft.com/office/word/2012/wordml" xmlns:w16cex="http://schemas.microsoft.com/office/word/2018/wordml/cex" xmlns:w16cid="http://schemas.microsoft.com/office/word/2016/wordml/cid" xmlns:w16="http://schemas.microsoft.com/office/word/2018/wordml" xmlns:w16sdtdh="http://schemas.microsoft.com/office/word/2020/wordml/sdtdatahash" xmlns:w16se="http://schemas.microsoft.com/office/word/2015/wordml/symex" xmlns:wpg="http://schemas.microsoft.com/office/word/2010/wordprocessingGroup" xmlns:wpi="http://schemas.microsoft.com/office/word/2010/wordprocessingInk" xmlns:wne="http://schemas.microsoft.com/office/word/2006/wordml" xmlns:wps="http://schemas.microsoft.com/office/word/2010/wordprocessingShape" mc:Ignorable="w14 w15 w16se w16cid w16 w16cex w16sdtdh wp14">
   <w:body>
     <w:p>
       <w:pPr>
@@ -137,6 +137,7 @@
         </w:rPr>
         <w:t xml:space="preserve">: </w:t>
       </w:r>
+      <w:proofErr w:type="gramStart"/>
       <w:r>
         <w:rPr>
           <w:sz w:val="28"/>
@@ -158,6 +159,7 @@
         </w:rPr>
         <w:t>(</w:t>
       </w:r>
+      <w:proofErr w:type="gramEnd"/>
       <w:r>
         <w:rPr>
           <w:sz w:val="28"/>
@@ -396,7 +398,27 @@
           <w:sz w:val="28"/>
           <w:szCs w:val="28"/>
         </w:rPr>
-        <w:t>{ra}</w:t>
+        <w:t>{</w:t>
+      </w:r>
+      <w:proofErr w:type="spellStart"/>
+      <w:r>
+        <w:rPr>
+          <w:b/>
+          <w:bCs/>
+          <w:sz w:val="28"/>
+          <w:szCs w:val="28"/>
+        </w:rPr>
+        <w:t>ra</w:t>
+      </w:r>
+      <w:proofErr w:type="spellEnd"/>
+      <w:r>
+        <w:rPr>
+          <w:b/>
+          <w:bCs/>
+          <w:sz w:val="28"/>
+          <w:szCs w:val="28"/>
+        </w:rPr>
+        <w:t>}</w:t>
       </w:r>
     </w:p>
     <w:p>
@@ -892,27 +914,50 @@
           <w:sz w:val="20"/>
           <w:szCs w:val="20"/>
         </w:rPr>
-        <w:t>{cargoEmissor}</w:t>
-      </w:r>
+        <w:t>{</w:t>
+      </w:r>
+      <w:proofErr w:type="spellStart"/>
       <w:r>
         <w:rPr>
           <w:b/>
           <w:sz w:val="20"/>
           <w:szCs w:val="20"/>
         </w:rPr>
-        <w:t xml:space="preserve"> </w:t>
-      </w:r>
+        <w:t>cargoEmissor</w:t>
+      </w:r>
+      <w:proofErr w:type="spellEnd"/>
       <w:r>
         <w:rPr>
           <w:b/>
           <w:sz w:val="20"/>
           <w:szCs w:val="20"/>
         </w:rPr>
+        <w:t>}</w:t>
+      </w:r>
+      <w:r>
+        <w:rPr>
+          <w:b/>
+          <w:sz w:val="20"/>
+          <w:szCs w:val="20"/>
+        </w:rPr>
+        <w:t xml:space="preserve"> </w:t>
+      </w:r>
+      <w:r>
+        <w:rPr>
+          <w:b/>
+          <w:sz w:val="20"/>
+          <w:szCs w:val="20"/>
+        </w:rPr>
         <w:t>RESPONSÁVEL PELAS INFORMAÇÕES</w:t>
       </w:r>
     </w:p>
     <w:sectPr>
-      <w:headerReference w:type="default" r:id="rId8"/>
+      <w:headerReference w:type="even" r:id="rId8"/>
+      <w:headerReference w:type="default" r:id="rId9"/>
+      <w:footerReference w:type="even" r:id="rId10"/>
+      <w:footerReference w:type="default" r:id="rId11"/>
+      <w:headerReference w:type="first" r:id="rId12"/>
+      <w:footerReference w:type="first" r:id="rId13"/>
       <w:pgSz w:w="11906" w:h="16838"/>
       <w:pgMar w:top="1417" w:right="1701" w:bottom="1417" w:left="1701" w:header="708" w:footer="708" w:gutter="0"/>
       <w:cols w:space="708"/>
@@ -923,7 +968,7 @@
 </file>
 
 <file path=word/endnotes.xml><?xml version="1.0" encoding="utf-8"?>
-<w:endnotes xmlns:wpc="http://schemas.microsoft.com/office/word/2010/wordprocessingCanvas" xmlns:cx="http://schemas.microsoft.com/office/drawing/2014/chartex" xmlns:cx1="http://schemas.microsoft.com/office/drawing/2015/9/8/chartex" xmlns:cx2="http://schemas.microsoft.com/office/drawing/2015/10/21/chartex" xmlns:cx3="http://schemas.microsoft.com/office/drawing/2016/5/9/chartex" xmlns:cx4="http://schemas.microsoft.com/office/drawing/2016/5/10/chartex" xmlns:cx5="http://schemas.microsoft.com/office/drawing/2016/5/11/chartex" xmlns:cx6="http://schemas.microsoft.com/office/drawing/2016/5/12/chartex" xmlns:cx7="http://schemas.microsoft.com/office/drawing/2016/5/13/chartex" xmlns:cx8="http://schemas.microsoft.com/office/drawing/2016/5/14/chartex" xmlns:mc="http://schemas.openxmlformats.org/markup-compatibility/2006" xmlns:aink="http://schemas.microsoft.com/office/drawing/2016/ink" xmlns:am3d="http://schemas.microsoft.com/office/drawing/2017/model3d" xmlns:o="urn:schemas-microsoft-com:office:office" xmlns:oel="http://schemas.microsoft.com/office/2019/extlst" xmlns:r="http://schemas.openxmlformats.org/officeDocument/2006/relationships" xmlns:m="http://schemas.openxmlformats.org/officeDocument/2006/math" xmlns:v="urn:schemas-microsoft-com:vml" xmlns:wp14="http://schemas.microsoft.com/office/word/2010/wordprocessingDrawing" xmlns:wp="http://schemas.openxmlformats.org/drawingml/2006/wordprocessingDrawing" xmlns:w10="urn:schemas-microsoft-com:office:word" xmlns:w="http://schemas.openxmlformats.org/wordprocessingml/2006/main" xmlns:w14="http://schemas.microsoft.com/office/word/2010/wordml" xmlns:w15="http://schemas.microsoft.com/office/word/2012/wordml" xmlns:w16cex="http://schemas.microsoft.com/office/word/2018/wordml/cex" xmlns:w16cid="http://schemas.microsoft.com/office/word/2016/wordml/cid" xmlns:w16="http://schemas.microsoft.com/office/word/2018/wordml" xmlns:w16du="http://schemas.microsoft.com/office/word/2023/wordml/word16du" xmlns:w16sdtdh="http://schemas.microsoft.com/office/word/2020/wordml/sdtdatahash" xmlns:w16sdtfl="http://schemas.microsoft.com/office/word/2024/wordml/sdtformatlock" xmlns:w16se="http://schemas.microsoft.com/office/word/2015/wordml/symex" xmlns:wpg="http://schemas.microsoft.com/office/word/2010/wordprocessingGroup" xmlns:wpi="http://schemas.microsoft.com/office/word/2010/wordprocessingInk" xmlns:wne="http://schemas.microsoft.com/office/word/2006/wordml" xmlns:wps="http://schemas.microsoft.com/office/word/2010/wordprocessingShape" mc:Ignorable="w14 w15 w16se w16cid w16 w16cex w16sdtdh w16sdtfl w16du wp14">
+<w:endnotes xmlns:wpc="http://schemas.microsoft.com/office/word/2010/wordprocessingCanvas" xmlns:cx="http://schemas.microsoft.com/office/drawing/2014/chartex" xmlns:cx1="http://schemas.microsoft.com/office/drawing/2015/9/8/chartex" xmlns:cx2="http://schemas.microsoft.com/office/drawing/2015/10/21/chartex" xmlns:cx3="http://schemas.microsoft.com/office/drawing/2016/5/9/chartex" xmlns:cx4="http://schemas.microsoft.com/office/drawing/2016/5/10/chartex" xmlns:cx5="http://schemas.microsoft.com/office/drawing/2016/5/11/chartex" xmlns:cx6="http://schemas.microsoft.com/office/drawing/2016/5/12/chartex" xmlns:cx7="http://schemas.microsoft.com/office/drawing/2016/5/13/chartex" xmlns:cx8="http://schemas.microsoft.com/office/drawing/2016/5/14/chartex" xmlns:mc="http://schemas.openxmlformats.org/markup-compatibility/2006" xmlns:aink="http://schemas.microsoft.com/office/drawing/2016/ink" xmlns:am3d="http://schemas.microsoft.com/office/drawing/2017/model3d" xmlns:o="urn:schemas-microsoft-com:office:office" xmlns:r="http://schemas.openxmlformats.org/officeDocument/2006/relationships" xmlns:m="http://schemas.openxmlformats.org/officeDocument/2006/math" xmlns:v="urn:schemas-microsoft-com:vml" xmlns:wp14="http://schemas.microsoft.com/office/word/2010/wordprocessingDrawing" xmlns:wp="http://schemas.openxmlformats.org/drawingml/2006/wordprocessingDrawing" xmlns:w10="urn:schemas-microsoft-com:office:word" xmlns:w="http://schemas.openxmlformats.org/wordprocessingml/2006/main" xmlns:w14="http://schemas.microsoft.com/office/word/2010/wordml" xmlns:w15="http://schemas.microsoft.com/office/word/2012/wordml" xmlns:w16cex="http://schemas.microsoft.com/office/word/2018/wordml/cex" xmlns:w16cid="http://schemas.microsoft.com/office/word/2016/wordml/cid" xmlns:w16="http://schemas.microsoft.com/office/word/2018/wordml" xmlns:w16sdtdh="http://schemas.microsoft.com/office/word/2020/wordml/sdtdatahash" xmlns:w16se="http://schemas.microsoft.com/office/word/2015/wordml/symex" xmlns:wpg="http://schemas.microsoft.com/office/word/2010/wordprocessingGroup" xmlns:wpi="http://schemas.microsoft.com/office/word/2010/wordprocessingInk" xmlns:wne="http://schemas.microsoft.com/office/word/2006/wordml" xmlns:wps="http://schemas.microsoft.com/office/word/2010/wordprocessingShape" mc:Ignorable="w14 w15 w16se w16cid w16 w16cex w16sdtdh wp14">
   <w:endnote w:type="separator" w:id="-1">
     <w:p>
       <w:r>
@@ -941,8 +986,38 @@
 </w:endnotes>
 </file>
 
+<file path=word/footer1.xml><?xml version="1.0" encoding="utf-8"?>
+<w:ftr xmlns:wpc="http://schemas.microsoft.com/office/word/2010/wordprocessingCanvas" xmlns:cx="http://schemas.microsoft.com/office/drawing/2014/chartex" xmlns:cx1="http://schemas.microsoft.com/office/drawing/2015/9/8/chartex" xmlns:cx2="http://schemas.microsoft.com/office/drawing/2015/10/21/chartex" xmlns:cx3="http://schemas.microsoft.com/office/drawing/2016/5/9/chartex" xmlns:cx4="http://schemas.microsoft.com/office/drawing/2016/5/10/chartex" xmlns:cx5="http://schemas.microsoft.com/office/drawing/2016/5/11/chartex" xmlns:cx6="http://schemas.microsoft.com/office/drawing/2016/5/12/chartex" xmlns:cx7="http://schemas.microsoft.com/office/drawing/2016/5/13/chartex" xmlns:cx8="http://schemas.microsoft.com/office/drawing/2016/5/14/chartex" xmlns:mc="http://schemas.openxmlformats.org/markup-compatibility/2006" xmlns:aink="http://schemas.microsoft.com/office/drawing/2016/ink" xmlns:am3d="http://schemas.microsoft.com/office/drawing/2017/model3d" xmlns:o="urn:schemas-microsoft-com:office:office" xmlns:r="http://schemas.openxmlformats.org/officeDocument/2006/relationships" xmlns:m="http://schemas.openxmlformats.org/officeDocument/2006/math" xmlns:v="urn:schemas-microsoft-com:vml" xmlns:wp14="http://schemas.microsoft.com/office/word/2010/wordprocessingDrawing" xmlns:wp="http://schemas.openxmlformats.org/drawingml/2006/wordprocessingDrawing" xmlns:w10="urn:schemas-microsoft-com:office:word" xmlns:w="http://schemas.openxmlformats.org/wordprocessingml/2006/main" xmlns:w14="http://schemas.microsoft.com/office/word/2010/wordml" xmlns:w15="http://schemas.microsoft.com/office/word/2012/wordml" xmlns:w16cex="http://schemas.microsoft.com/office/word/2018/wordml/cex" xmlns:w16cid="http://schemas.microsoft.com/office/word/2016/wordml/cid" xmlns:w16="http://schemas.microsoft.com/office/word/2018/wordml" xmlns:w16sdtdh="http://schemas.microsoft.com/office/word/2020/wordml/sdtdatahash" xmlns:w16se="http://schemas.microsoft.com/office/word/2015/wordml/symex" xmlns:wpg="http://schemas.microsoft.com/office/word/2010/wordprocessingGroup" xmlns:wpi="http://schemas.microsoft.com/office/word/2010/wordprocessingInk" xmlns:wne="http://schemas.microsoft.com/office/word/2006/wordml" xmlns:wps="http://schemas.microsoft.com/office/word/2010/wordprocessingShape" mc:Ignorable="w14 w15 w16se w16cid w16 w16cex w16sdtdh wp14">
+  <w:p>
+    <w:pPr>
+      <w:pStyle w:val="Rodap"/>
+    </w:pPr>
+  </w:p>
+</w:ftr>
+</file>
+
+<file path=word/footer2.xml><?xml version="1.0" encoding="utf-8"?>
+<w:ftr xmlns:wpc="http://schemas.microsoft.com/office/word/2010/wordprocessingCanvas" xmlns:cx="http://schemas.microsoft.com/office/drawing/2014/chartex" xmlns:cx1="http://schemas.microsoft.com/office/drawing/2015/9/8/chartex" xmlns:cx2="http://schemas.microsoft.com/office/drawing/2015/10/21/chartex" xmlns:cx3="http://schemas.microsoft.com/office/drawing/2016/5/9/chartex" xmlns:cx4="http://schemas.microsoft.com/office/drawing/2016/5/10/chartex" xmlns:cx5="http://schemas.microsoft.com/office/drawing/2016/5/11/chartex" xmlns:cx6="http://schemas.microsoft.com/office/drawing/2016/5/12/chartex" xmlns:cx7="http://schemas.microsoft.com/office/drawing/2016/5/13/chartex" xmlns:cx8="http://schemas.microsoft.com/office/drawing/2016/5/14/chartex" xmlns:mc="http://schemas.openxmlformats.org/markup-compatibility/2006" xmlns:aink="http://schemas.microsoft.com/office/drawing/2016/ink" xmlns:am3d="http://schemas.microsoft.com/office/drawing/2017/model3d" xmlns:o="urn:schemas-microsoft-com:office:office" xmlns:r="http://schemas.openxmlformats.org/officeDocument/2006/relationships" xmlns:m="http://schemas.openxmlformats.org/officeDocument/2006/math" xmlns:v="urn:schemas-microsoft-com:vml" xmlns:wp14="http://schemas.microsoft.com/office/word/2010/wordprocessingDrawing" xmlns:wp="http://schemas.openxmlformats.org/drawingml/2006/wordprocessingDrawing" xmlns:w10="urn:schemas-microsoft-com:office:word" xmlns:w="http://schemas.openxmlformats.org/wordprocessingml/2006/main" xmlns:w14="http://schemas.microsoft.com/office/word/2010/wordml" xmlns:w15="http://schemas.microsoft.com/office/word/2012/wordml" xmlns:w16cex="http://schemas.microsoft.com/office/word/2018/wordml/cex" xmlns:w16cid="http://schemas.microsoft.com/office/word/2016/wordml/cid" xmlns:w16="http://schemas.microsoft.com/office/word/2018/wordml" xmlns:w16sdtdh="http://schemas.microsoft.com/office/word/2020/wordml/sdtdatahash" xmlns:w16se="http://schemas.microsoft.com/office/word/2015/wordml/symex" xmlns:wpg="http://schemas.microsoft.com/office/word/2010/wordprocessingGroup" xmlns:wpi="http://schemas.microsoft.com/office/word/2010/wordprocessingInk" xmlns:wne="http://schemas.microsoft.com/office/word/2006/wordml" xmlns:wps="http://schemas.microsoft.com/office/word/2010/wordprocessingShape" mc:Ignorable="w14 w15 w16se w16cid w16 w16cex w16sdtdh wp14">
+  <w:p>
+    <w:pPr>
+      <w:pStyle w:val="Rodap"/>
+    </w:pPr>
+  </w:p>
+</w:ftr>
+</file>
+
+<file path=word/footer3.xml><?xml version="1.0" encoding="utf-8"?>
+<w:ftr xmlns:wpc="http://schemas.microsoft.com/office/word/2010/wordprocessingCanvas" xmlns:cx="http://schemas.microsoft.com/office/drawing/2014/chartex" xmlns:cx1="http://schemas.microsoft.com/office/drawing/2015/9/8/chartex" xmlns:cx2="http://schemas.microsoft.com/office/drawing/2015/10/21/chartex" xmlns:cx3="http://schemas.microsoft.com/office/drawing/2016/5/9/chartex" xmlns:cx4="http://schemas.microsoft.com/office/drawing/2016/5/10/chartex" xmlns:cx5="http://schemas.microsoft.com/office/drawing/2016/5/11/chartex" xmlns:cx6="http://schemas.microsoft.com/office/drawing/2016/5/12/chartex" xmlns:cx7="http://schemas.microsoft.com/office/drawing/2016/5/13/chartex" xmlns:cx8="http://schemas.microsoft.com/office/drawing/2016/5/14/chartex" xmlns:mc="http://schemas.openxmlformats.org/markup-compatibility/2006" xmlns:aink="http://schemas.microsoft.com/office/drawing/2016/ink" xmlns:am3d="http://schemas.microsoft.com/office/drawing/2017/model3d" xmlns:o="urn:schemas-microsoft-com:office:office" xmlns:r="http://schemas.openxmlformats.org/officeDocument/2006/relationships" xmlns:m="http://schemas.openxmlformats.org/officeDocument/2006/math" xmlns:v="urn:schemas-microsoft-com:vml" xmlns:wp14="http://schemas.microsoft.com/office/word/2010/wordprocessingDrawing" xmlns:wp="http://schemas.openxmlformats.org/drawingml/2006/wordprocessingDrawing" xmlns:w10="urn:schemas-microsoft-com:office:word" xmlns:w="http://schemas.openxmlformats.org/wordprocessingml/2006/main" xmlns:w14="http://schemas.microsoft.com/office/word/2010/wordml" xmlns:w15="http://schemas.microsoft.com/office/word/2012/wordml" xmlns:w16cex="http://schemas.microsoft.com/office/word/2018/wordml/cex" xmlns:w16cid="http://schemas.microsoft.com/office/word/2016/wordml/cid" xmlns:w16="http://schemas.microsoft.com/office/word/2018/wordml" xmlns:w16sdtdh="http://schemas.microsoft.com/office/word/2020/wordml/sdtdatahash" xmlns:w16se="http://schemas.microsoft.com/office/word/2015/wordml/symex" xmlns:wpg="http://schemas.microsoft.com/office/word/2010/wordprocessingGroup" xmlns:wpi="http://schemas.microsoft.com/office/word/2010/wordprocessingInk" xmlns:wne="http://schemas.microsoft.com/office/word/2006/wordml" xmlns:wps="http://schemas.microsoft.com/office/word/2010/wordprocessingShape" mc:Ignorable="w14 w15 w16se w16cid w16 w16cex w16sdtdh wp14">
+  <w:p>
+    <w:pPr>
+      <w:pStyle w:val="Rodap"/>
+    </w:pPr>
+  </w:p>
+</w:ftr>
+</file>
+
 <file path=word/footnotes.xml><?xml version="1.0" encoding="utf-8"?>
-<w:footnotes xmlns:wpc="http://schemas.microsoft.com/office/word/2010/wordprocessingCanvas" xmlns:cx="http://schemas.microsoft.com/office/drawing/2014/chartex" xmlns:cx1="http://schemas.microsoft.com/office/drawing/2015/9/8/chartex" xmlns:cx2="http://schemas.microsoft.com/office/drawing/2015/10/21/chartex" xmlns:cx3="http://schemas.microsoft.com/office/drawing/2016/5/9/chartex" xmlns:cx4="http://schemas.microsoft.com/office/drawing/2016/5/10/chartex" xmlns:cx5="http://schemas.microsoft.com/office/drawing/2016/5/11/chartex" xmlns:cx6="http://schemas.microsoft.com/office/drawing/2016/5/12/chartex" xmlns:cx7="http://schemas.microsoft.com/office/drawing/2016/5/13/chartex" xmlns:cx8="http://schemas.microsoft.com/office/drawing/2016/5/14/chartex" xmlns:mc="http://schemas.openxmlformats.org/markup-compatibility/2006" xmlns:aink="http://schemas.microsoft.com/office/drawing/2016/ink" xmlns:am3d="http://schemas.microsoft.com/office/drawing/2017/model3d" xmlns:o="urn:schemas-microsoft-com:office:office" xmlns:oel="http://schemas.microsoft.com/office/2019/extlst" xmlns:r="http://schemas.openxmlformats.org/officeDocument/2006/relationships" xmlns:m="http://schemas.openxmlformats.org/officeDocument/2006/math" xmlns:v="urn:schemas-microsoft-com:vml" xmlns:wp14="http://schemas.microsoft.com/office/word/2010/wordprocessingDrawing" xmlns:wp="http://schemas.openxmlformats.org/drawingml/2006/wordprocessingDrawing" xmlns:w10="urn:schemas-microsoft-com:office:word" xmlns:w="http://schemas.openxmlformats.org/wordprocessingml/2006/main" xmlns:w14="http://schemas.microsoft.com/office/word/2010/wordml" xmlns:w15="http://schemas.microsoft.com/office/word/2012/wordml" xmlns:w16cex="http://schemas.microsoft.com/office/word/2018/wordml/cex" xmlns:w16cid="http://schemas.microsoft.com/office/word/2016/wordml/cid" xmlns:w16="http://schemas.microsoft.com/office/word/2018/wordml" xmlns:w16du="http://schemas.microsoft.com/office/word/2023/wordml/word16du" xmlns:w16sdtdh="http://schemas.microsoft.com/office/word/2020/wordml/sdtdatahash" xmlns:w16sdtfl="http://schemas.microsoft.com/office/word/2024/wordml/sdtformatlock" xmlns:w16se="http://schemas.microsoft.com/office/word/2015/wordml/symex" xmlns:wpg="http://schemas.microsoft.com/office/word/2010/wordprocessingGroup" xmlns:wpi="http://schemas.microsoft.com/office/word/2010/wordprocessingInk" xmlns:wne="http://schemas.microsoft.com/office/word/2006/wordml" xmlns:wps="http://schemas.microsoft.com/office/word/2010/wordprocessingShape" mc:Ignorable="w14 w15 w16se w16cid w16 w16cex w16sdtdh w16sdtfl w16du wp14">
+<w:footnotes xmlns:wpc="http://schemas.microsoft.com/office/word/2010/wordprocessingCanvas" xmlns:cx="http://schemas.microsoft.com/office/drawing/2014/chartex" xmlns:cx1="http://schemas.microsoft.com/office/drawing/2015/9/8/chartex" xmlns:cx2="http://schemas.microsoft.com/office/drawing/2015/10/21/chartex" xmlns:cx3="http://schemas.microsoft.com/office/drawing/2016/5/9/chartex" xmlns:cx4="http://schemas.microsoft.com/office/drawing/2016/5/10/chartex" xmlns:cx5="http://schemas.microsoft.com/office/drawing/2016/5/11/chartex" xmlns:cx6="http://schemas.microsoft.com/office/drawing/2016/5/12/chartex" xmlns:cx7="http://schemas.microsoft.com/office/drawing/2016/5/13/chartex" xmlns:cx8="http://schemas.microsoft.com/office/drawing/2016/5/14/chartex" xmlns:mc="http://schemas.openxmlformats.org/markup-compatibility/2006" xmlns:aink="http://schemas.microsoft.com/office/drawing/2016/ink" xmlns:am3d="http://schemas.microsoft.com/office/drawing/2017/model3d" xmlns:o="urn:schemas-microsoft-com:office:office" xmlns:r="http://schemas.openxmlformats.org/officeDocument/2006/relationships" xmlns:m="http://schemas.openxmlformats.org/officeDocument/2006/math" xmlns:v="urn:schemas-microsoft-com:vml" xmlns:wp14="http://schemas.microsoft.com/office/word/2010/wordprocessingDrawing" xmlns:wp="http://schemas.openxmlformats.org/drawingml/2006/wordprocessingDrawing" xmlns:w10="urn:schemas-microsoft-com:office:word" xmlns:w="http://schemas.openxmlformats.org/wordprocessingml/2006/main" xmlns:w14="http://schemas.microsoft.com/office/word/2010/wordml" xmlns:w15="http://schemas.microsoft.com/office/word/2012/wordml" xmlns:w16cex="http://schemas.microsoft.com/office/word/2018/wordml/cex" xmlns:w16cid="http://schemas.microsoft.com/office/word/2016/wordml/cid" xmlns:w16="http://schemas.microsoft.com/office/word/2018/wordml" xmlns:w16sdtdh="http://schemas.microsoft.com/office/word/2020/wordml/sdtdatahash" xmlns:w16se="http://schemas.microsoft.com/office/word/2015/wordml/symex" xmlns:wpg="http://schemas.microsoft.com/office/word/2010/wordprocessingGroup" xmlns:wpi="http://schemas.microsoft.com/office/word/2010/wordprocessingInk" xmlns:wne="http://schemas.microsoft.com/office/word/2006/wordml" xmlns:wps="http://schemas.microsoft.com/office/word/2010/wordprocessingShape" mc:Ignorable="w14 w15 w16se w16cid w16 w16cex w16sdtdh wp14">
   <w:footnote w:type="separator" w:id="-1">
     <w:p>
       <w:r>
@@ -961,288 +1036,260 @@
 </file>
 
 <file path=word/header1.xml><?xml version="1.0" encoding="utf-8"?>
-<w:hdr xmlns:wpc="http://schemas.microsoft.com/office/word/2010/wordprocessingCanvas" xmlns:cx="http://schemas.microsoft.com/office/drawing/2014/chartex" xmlns:cx1="http://schemas.microsoft.com/office/drawing/2015/9/8/chartex" xmlns:cx2="http://schemas.microsoft.com/office/drawing/2015/10/21/chartex" xmlns:cx3="http://schemas.microsoft.com/office/drawing/2016/5/9/chartex" xmlns:cx4="http://schemas.microsoft.com/office/drawing/2016/5/10/chartex" xmlns:cx5="http://schemas.microsoft.com/office/drawing/2016/5/11/chartex" xmlns:cx6="http://schemas.microsoft.com/office/drawing/2016/5/12/chartex" xmlns:cx7="http://schemas.microsoft.com/office/drawing/2016/5/13/chartex" xmlns:cx8="http://schemas.microsoft.com/office/drawing/2016/5/14/chartex" xmlns:mc="http://schemas.openxmlformats.org/markup-compatibility/2006" xmlns:aink="http://schemas.microsoft.com/office/drawing/2016/ink" xmlns:am3d="http://schemas.microsoft.com/office/drawing/2017/model3d" xmlns:o="urn:schemas-microsoft-com:office:office" xmlns:oel="http://schemas.microsoft.com/office/2019/extlst" xmlns:r="http://schemas.openxmlformats.org/officeDocument/2006/relationships" xmlns:m="http://schemas.openxmlformats.org/officeDocument/2006/math" xmlns:v="urn:schemas-microsoft-com:vml" xmlns:wp14="http://schemas.microsoft.com/office/word/2010/wordprocessingDrawing" xmlns:wp="http://schemas.openxmlformats.org/drawingml/2006/wordprocessingDrawing" xmlns:w10="urn:schemas-microsoft-com:office:word" xmlns:w="http://schemas.openxmlformats.org/wordprocessingml/2006/main" xmlns:w14="http://schemas.microsoft.com/office/word/2010/wordml" xmlns:w15="http://schemas.microsoft.com/office/word/2012/wordml" xmlns:w16cex="http://schemas.microsoft.com/office/word/2018/wordml/cex" xmlns:w16cid="http://schemas.microsoft.com/office/word/2016/wordml/cid" xmlns:w16="http://schemas.microsoft.com/office/word/2018/wordml" xmlns:w16du="http://schemas.microsoft.com/office/word/2023/wordml/word16du" xmlns:w16sdtdh="http://schemas.microsoft.com/office/word/2020/wordml/sdtdatahash" xmlns:w16sdtfl="http://schemas.microsoft.com/office/word/2024/wordml/sdtformatlock" xmlns:w16se="http://schemas.microsoft.com/office/word/2015/wordml/symex" xmlns:wpg="http://schemas.microsoft.com/office/word/2010/wordprocessingGroup" xmlns:wpi="http://schemas.microsoft.com/office/word/2010/wordprocessingInk" xmlns:wne="http://schemas.microsoft.com/office/word/2006/wordml" xmlns:wps="http://schemas.microsoft.com/office/word/2010/wordprocessingShape" mc:Ignorable="w14 w15 w16se w16cid w16 w16cex w16sdtdh w16sdtfl w16du wp14">
+<w:hdr xmlns:wpc="http://schemas.microsoft.com/office/word/2010/wordprocessingCanvas" xmlns:cx="http://schemas.microsoft.com/office/drawing/2014/chartex" xmlns:cx1="http://schemas.microsoft.com/office/drawing/2015/9/8/chartex" xmlns:cx2="http://schemas.microsoft.com/office/drawing/2015/10/21/chartex" xmlns:cx3="http://schemas.microsoft.com/office/drawing/2016/5/9/chartex" xmlns:cx4="http://schemas.microsoft.com/office/drawing/2016/5/10/chartex" xmlns:cx5="http://schemas.microsoft.com/office/drawing/2016/5/11/chartex" xmlns:cx6="http://schemas.microsoft.com/office/drawing/2016/5/12/chartex" xmlns:cx7="http://schemas.microsoft.com/office/drawing/2016/5/13/chartex" xmlns:cx8="http://schemas.microsoft.com/office/drawing/2016/5/14/chartex" xmlns:mc="http://schemas.openxmlformats.org/markup-compatibility/2006" xmlns:aink="http://schemas.microsoft.com/office/drawing/2016/ink" xmlns:am3d="http://schemas.microsoft.com/office/drawing/2017/model3d" xmlns:o="urn:schemas-microsoft-com:office:office" xmlns:r="http://schemas.openxmlformats.org/officeDocument/2006/relationships" xmlns:m="http://schemas.openxmlformats.org/officeDocument/2006/math" xmlns:v="urn:schemas-microsoft-com:vml" xmlns:wp14="http://schemas.microsoft.com/office/word/2010/wordprocessingDrawing" xmlns:wp="http://schemas.openxmlformats.org/drawingml/2006/wordprocessingDrawing" xmlns:w10="urn:schemas-microsoft-com:office:word" xmlns:w="http://schemas.openxmlformats.org/wordprocessingml/2006/main" xmlns:w14="http://schemas.microsoft.com/office/word/2010/wordml" xmlns:w15="http://schemas.microsoft.com/office/word/2012/wordml" xmlns:w16cex="http://schemas.microsoft.com/office/word/2018/wordml/cex" xmlns:w16cid="http://schemas.microsoft.com/office/word/2016/wordml/cid" xmlns:w16="http://schemas.microsoft.com/office/word/2018/wordml" xmlns:w16sdtdh="http://schemas.microsoft.com/office/word/2020/wordml/sdtdatahash" xmlns:w16se="http://schemas.microsoft.com/office/word/2015/wordml/symex" xmlns:wpg="http://schemas.microsoft.com/office/word/2010/wordprocessingGroup" xmlns:wpi="http://schemas.microsoft.com/office/word/2010/wordprocessingInk" xmlns:wne="http://schemas.microsoft.com/office/word/2006/wordml" xmlns:wps="http://schemas.microsoft.com/office/word/2010/wordprocessingShape" mc:Ignorable="w14 w15 w16se w16cid w16 w16cex w16sdtdh wp14">
   <w:p>
     <w:pPr>
+      <w:pStyle w:val="Cabealho"/>
+    </w:pPr>
+  </w:p>
+</w:hdr>
+</file>
+
+<file path=word/header2.xml><?xml version="1.0" encoding="utf-8"?>
+<w:hdr xmlns:wpc="http://schemas.microsoft.com/office/word/2010/wordprocessingCanvas" xmlns:cx="http://schemas.microsoft.com/office/drawing/2014/chartex" xmlns:cx1="http://schemas.microsoft.com/office/drawing/2015/9/8/chartex" xmlns:cx2="http://schemas.microsoft.com/office/drawing/2015/10/21/chartex" xmlns:cx3="http://schemas.microsoft.com/office/drawing/2016/5/9/chartex" xmlns:cx4="http://schemas.microsoft.com/office/drawing/2016/5/10/chartex" xmlns:cx5="http://schemas.microsoft.com/office/drawing/2016/5/11/chartex" xmlns:cx6="http://schemas.microsoft.com/office/drawing/2016/5/12/chartex" xmlns:cx7="http://schemas.microsoft.com/office/drawing/2016/5/13/chartex" xmlns:cx8="http://schemas.microsoft.com/office/drawing/2016/5/14/chartex" xmlns:mc="http://schemas.openxmlformats.org/markup-compatibility/2006" xmlns:aink="http://schemas.microsoft.com/office/drawing/2016/ink" xmlns:am3d="http://schemas.microsoft.com/office/drawing/2017/model3d" xmlns:o="urn:schemas-microsoft-com:office:office" xmlns:r="http://schemas.openxmlformats.org/officeDocument/2006/relationships" xmlns:m="http://schemas.openxmlformats.org/officeDocument/2006/math" xmlns:v="urn:schemas-microsoft-com:vml" xmlns:wp14="http://schemas.microsoft.com/office/word/2010/wordprocessingDrawing" xmlns:wp="http://schemas.openxmlformats.org/drawingml/2006/wordprocessingDrawing" xmlns:w10="urn:schemas-microsoft-com:office:word" xmlns:w="http://schemas.openxmlformats.org/wordprocessingml/2006/main" xmlns:w14="http://schemas.microsoft.com/office/word/2010/wordml" xmlns:w15="http://schemas.microsoft.com/office/word/2012/wordml" xmlns:w16cex="http://schemas.microsoft.com/office/word/2018/wordml/cex" xmlns:w16cid="http://schemas.microsoft.com/office/word/2016/wordml/cid" xmlns:w16="http://schemas.microsoft.com/office/word/2018/wordml" xmlns:w16sdtdh="http://schemas.microsoft.com/office/word/2020/wordml/sdtdatahash" xmlns:w16se="http://schemas.microsoft.com/office/word/2015/wordml/symex" xmlns:wpg="http://schemas.microsoft.com/office/word/2010/wordprocessingGroup" xmlns:wpi="http://schemas.microsoft.com/office/word/2010/wordprocessingInk" xmlns:wne="http://schemas.microsoft.com/office/word/2006/wordml" xmlns:wps="http://schemas.microsoft.com/office/word/2010/wordprocessingShape" mc:Ignorable="w14 w15 w16se w16cid w16 w16cex w16sdtdh wp14">
+  <w:p>
+    <w:pPr>
+      <w:pBdr>
+        <w:top w:val="nil"/>
+        <w:left w:val="nil"/>
+        <w:bottom w:val="nil"/>
+        <w:right w:val="nil"/>
+        <w:between w:val="nil"/>
+      </w:pBdr>
+      <w:tabs>
+        <w:tab w:val="center" w:pos="4252"/>
+        <w:tab w:val="right" w:pos="8504"/>
+        <w:tab w:val="left" w:pos="2580"/>
+        <w:tab w:val="left" w:pos="2985"/>
+      </w:tabs>
+      <w:spacing w:after="120" w:line="276" w:lineRule="auto"/>
       <w:jc w:val="center"/>
       <w:rPr>
-        <w:rFonts w:ascii="Verdana" w:hAnsi="Verdana"/>
+        <w:color w:val="000000"/>
+        <w:sz w:val="32"/>
+        <w:szCs w:val="32"/>
+      </w:rPr>
+    </w:pPr>
+    <w:r>
+      <w:rPr>
+        <w:noProof/>
+      </w:rPr>
+      <w:drawing>
+        <wp:anchor distT="0" distB="0" distL="0" distR="0" simplePos="0" relativeHeight="251659264" behindDoc="1" locked="0" layoutInCell="1" hidden="0" allowOverlap="1" wp14:anchorId="6C2F43D4" wp14:editId="3C66BF9F">
+          <wp:simplePos x="0" y="0"/>
+          <wp:positionH relativeFrom="rightMargin">
+            <wp:posOffset>-152400</wp:posOffset>
+          </wp:positionH>
+          <wp:positionV relativeFrom="paragraph">
+            <wp:posOffset>-5715</wp:posOffset>
+          </wp:positionV>
+          <wp:extent cx="971550" cy="927735"/>
+          <wp:effectExtent l="0" t="0" r="0" b="5715"/>
+          <wp:wrapNone/>
+          <wp:docPr id="5" name="image2.jpg" descr="C:\Users\EUNICE\Desktop\5dac05df-98dd-433e-8b60-a90ccd3d25b7.jpg"/>
+          <wp:cNvGraphicFramePr/>
+          <a:graphic xmlns:a="http://schemas.openxmlformats.org/drawingml/2006/main">
+            <a:graphicData uri="http://schemas.openxmlformats.org/drawingml/2006/picture">
+              <pic:pic xmlns:pic="http://schemas.openxmlformats.org/drawingml/2006/picture">
+                <pic:nvPicPr>
+                  <pic:cNvPr id="0" name="image2.jpg" descr="C:\Users\EUNICE\Desktop\5dac05df-98dd-433e-8b60-a90ccd3d25b7.jpg"/>
+                  <pic:cNvPicPr preferRelativeResize="0"/>
+                </pic:nvPicPr>
+                <pic:blipFill>
+                  <a:blip r:embed="rId1"/>
+                  <a:srcRect/>
+                  <a:stretch>
+                    <a:fillRect/>
+                  </a:stretch>
+                </pic:blipFill>
+                <pic:spPr>
+                  <a:xfrm>
+                    <a:off x="0" y="0"/>
+                    <a:ext cx="971550" cy="927735"/>
+                  </a:xfrm>
+                  <a:prstGeom prst="rect">
+                    <a:avLst/>
+                  </a:prstGeom>
+                  <a:ln/>
+                </pic:spPr>
+              </pic:pic>
+            </a:graphicData>
+          </a:graphic>
+        </wp:anchor>
+      </w:drawing>
+    </w:r>
+    <w:r>
+      <w:rPr>
+        <w:noProof/>
+      </w:rPr>
+      <w:drawing>
+        <wp:anchor distT="0" distB="0" distL="0" distR="0" simplePos="0" relativeHeight="251660288" behindDoc="1" locked="0" layoutInCell="1" hidden="0" allowOverlap="1" wp14:anchorId="6D32DB40" wp14:editId="1600D109">
+          <wp:simplePos x="0" y="0"/>
+          <wp:positionH relativeFrom="column">
+            <wp:posOffset>-721360</wp:posOffset>
+          </wp:positionH>
+          <wp:positionV relativeFrom="paragraph">
+            <wp:posOffset>-125730</wp:posOffset>
+          </wp:positionV>
+          <wp:extent cx="1090876" cy="1153811"/>
+          <wp:effectExtent l="0" t="0" r="0" b="0"/>
+          <wp:wrapNone/>
+          <wp:docPr id="1" name="image1.png"/>
+          <wp:cNvGraphicFramePr/>
+          <a:graphic xmlns:a="http://schemas.openxmlformats.org/drawingml/2006/main">
+            <a:graphicData uri="http://schemas.openxmlformats.org/drawingml/2006/picture">
+              <pic:pic xmlns:pic="http://schemas.openxmlformats.org/drawingml/2006/picture">
+                <pic:nvPicPr>
+                  <pic:cNvPr id="0" name="image1.png"/>
+                  <pic:cNvPicPr preferRelativeResize="0"/>
+                </pic:nvPicPr>
+                <pic:blipFill>
+                  <a:blip r:embed="rId2"/>
+                  <a:srcRect/>
+                  <a:stretch>
+                    <a:fillRect/>
+                  </a:stretch>
+                </pic:blipFill>
+                <pic:spPr>
+                  <a:xfrm>
+                    <a:off x="0" y="0"/>
+                    <a:ext cx="1090876" cy="1153811"/>
+                  </a:xfrm>
+                  <a:prstGeom prst="rect">
+                    <a:avLst/>
+                  </a:prstGeom>
+                  <a:ln/>
+                </pic:spPr>
+              </pic:pic>
+            </a:graphicData>
+          </a:graphic>
+        </wp:anchor>
+      </w:drawing>
+    </w:r>
+    <w:r>
+      <w:rPr>
+        <w:color w:val="000000"/>
+        <w:sz w:val="32"/>
+        <w:szCs w:val="32"/>
+      </w:rPr>
+      <w:t>MUNICÍPIO DE SÃO JOÃO DE IRACEMA</w:t>
+    </w:r>
+  </w:p>
+  <w:p>
+    <w:pPr>
+      <w:pBdr>
+        <w:top w:val="nil"/>
+        <w:left w:val="nil"/>
+        <w:bottom w:val="nil"/>
+        <w:right w:val="nil"/>
+        <w:between w:val="nil"/>
+      </w:pBdr>
+      <w:tabs>
+        <w:tab w:val="center" w:pos="4252"/>
+        <w:tab w:val="right" w:pos="8504"/>
+        <w:tab w:val="left" w:pos="2580"/>
+        <w:tab w:val="left" w:pos="2985"/>
+      </w:tabs>
+      <w:spacing w:after="120" w:line="276" w:lineRule="auto"/>
+      <w:jc w:val="center"/>
+      <w:rPr>
+        <w:color w:val="000000"/>
+        <w:sz w:val="36"/>
+        <w:szCs w:val="36"/>
+      </w:rPr>
+    </w:pPr>
+    <w:r>
+      <w:rPr>
+        <w:color w:val="000000"/>
+        <w:sz w:val="36"/>
+        <w:szCs w:val="36"/>
+      </w:rPr>
+      <w:t>EMEF “ALFREDINA COELHO”</w:t>
+    </w:r>
+  </w:p>
+  <w:p>
+    <w:pPr>
+      <w:pBdr>
+        <w:top w:val="nil"/>
+        <w:left w:val="nil"/>
+        <w:bottom w:val="nil"/>
+        <w:right w:val="nil"/>
+        <w:between w:val="nil"/>
+      </w:pBdr>
+      <w:tabs>
+        <w:tab w:val="center" w:pos="4252"/>
+        <w:tab w:val="right" w:pos="8504"/>
+        <w:tab w:val="left" w:pos="2580"/>
+        <w:tab w:val="left" w:pos="2985"/>
+      </w:tabs>
+      <w:spacing w:after="120" w:line="276" w:lineRule="auto"/>
+      <w:jc w:val="center"/>
+      <w:rPr>
         <w:b/>
+        <w:bCs/>
+        <w:color w:val="000000"/>
+        <w:sz w:val="16"/>
+        <w:szCs w:val="16"/>
+      </w:rPr>
+    </w:pPr>
+    <w:r>
+      <w:rPr>
+        <w:b/>
+        <w:bCs/>
+        <w:color w:val="000000"/>
+        <w:sz w:val="16"/>
+        <w:szCs w:val="16"/>
+      </w:rPr>
+      <w:t>RUA MOYSÉS DOMINGUES RODRIGUES, 310 - CENTRO – SÃO JOÃO DE IRACEMA-SP</w:t>
+    </w:r>
+  </w:p>
+  <w:p>
+    <w:pPr>
+      <w:pBdr>
+        <w:top w:val="nil"/>
+        <w:left w:val="nil"/>
+        <w:bottom w:val="nil"/>
+        <w:right w:val="nil"/>
+        <w:between w:val="nil"/>
+      </w:pBdr>
+      <w:tabs>
+        <w:tab w:val="center" w:pos="4252"/>
+        <w:tab w:val="right" w:pos="8504"/>
+        <w:tab w:val="left" w:pos="2580"/>
+        <w:tab w:val="left" w:pos="2985"/>
+      </w:tabs>
+      <w:spacing w:after="120" w:line="276" w:lineRule="auto"/>
+      <w:jc w:val="center"/>
+      <w:rPr>
+        <w:b/>
+        <w:bCs/>
+        <w:color w:val="0000FF"/>
+        <w:sz w:val="16"/>
+        <w:szCs w:val="16"/>
         <w:u w:val="single"/>
       </w:rPr>
     </w:pPr>
     <w:r>
       <w:rPr>
-        <w:rFonts w:ascii="Calibri" w:eastAsia="Calibri" w:hAnsi="Calibri"/>
-        <w:noProof/>
-        <w:sz w:val="22"/>
-        <w:szCs w:val="22"/>
+        <w:b/>
+        <w:bCs/>
+        <w:color w:val="000000"/>
+        <w:sz w:val="16"/>
+        <w:szCs w:val="16"/>
       </w:rPr>
-      <w:object w:dxaOrig="1440" w:dyaOrig="1440" w14:anchorId="324EB01E">
-        <v:shapetype id="_x0000_t75" coordsize="21600,21600" o:spt="75" o:preferrelative="t" path="m@4@5l@4@11@9@11@9@5xe" filled="f" stroked="f">
-          <v:stroke joinstyle="miter"/>
-          <v:formulas>
-            <v:f eqn="if lineDrawn pixelLineWidth 0"/>
-            <v:f eqn="sum @0 1 0"/>
-            <v:f eqn="sum 0 0 @1"/>
-            <v:f eqn="prod @2 1 2"/>
-            <v:f eqn="prod @3 21600 pixelWidth"/>
-            <v:f eqn="prod @3 21600 pixelHeight"/>
-            <v:f eqn="sum @0 0 1"/>
-            <v:f eqn="prod @6 1 2"/>
-            <v:f eqn="prod @7 21600 pixelWidth"/>
-            <v:f eqn="sum @8 21600 0"/>
-            <v:f eqn="prod @7 21600 pixelHeight"/>
-            <v:f eqn="sum @10 21600 0"/>
-          </v:formulas>
-          <v:path o:extrusionok="f" gradientshapeok="t" o:connecttype="rect"/>
-          <o:lock v:ext="edit" aspectratio="t"/>
-        </v:shapetype>
-        <v:shape id="_x0000_s2051" type="#_x0000_t75" style="position:absolute;left:0;text-align:left;margin-left:-88.35pt;margin-top:1.05pt;width:110.4pt;height:98.55pt;z-index:-251658240;mso-position-horizontal-relative:text;mso-position-vertical-relative:text">
-          <v:imagedata r:id="rId1" o:title="" blacklevel="3932f"/>
-        </v:shape>
-        <o:OLEObject Type="Embed" ProgID="PBrush" ShapeID="_x0000_s2051" DrawAspect="Content" ObjectID="_1810617321" r:id="rId2"/>
-      </w:object>
+      <w:t xml:space="preserve"> E-MAIL: </w:t>
     </w:r>
-    <w:r>
-      <w:rPr>
-        <w:rFonts w:ascii="Arial" w:hAnsi="Arial" w:cs="Arial"/>
-        <w:noProof/>
-        <w:sz w:val="28"/>
-        <w:szCs w:val="28"/>
-      </w:rPr>
-      <w:drawing>
-        <wp:anchor distT="0" distB="0" distL="114300" distR="114300" simplePos="0" relativeHeight="251657216" behindDoc="1" locked="0" layoutInCell="1" allowOverlap="1" wp14:anchorId="0FC73615" wp14:editId="68728C88">
-          <wp:simplePos x="0" y="0"/>
-          <wp:positionH relativeFrom="column">
-            <wp:posOffset>5101590</wp:posOffset>
-          </wp:positionH>
-          <wp:positionV relativeFrom="paragraph">
-            <wp:posOffset>-1905</wp:posOffset>
-          </wp:positionV>
-          <wp:extent cx="1314450" cy="1314450"/>
-          <wp:effectExtent l="0" t="0" r="0" b="0"/>
-          <wp:wrapTight wrapText="bothSides">
-            <wp:wrapPolygon edited="0">
-              <wp:start x="0" y="0"/>
-              <wp:lineTo x="0" y="21287"/>
-              <wp:lineTo x="21287" y="21287"/>
-              <wp:lineTo x="21287" y="0"/>
-              <wp:lineTo x="0" y="0"/>
-            </wp:wrapPolygon>
-          </wp:wrapTight>
-          <wp:docPr id="9" name="Imagem 9" descr="C:\Users\EUNICE\Desktop\5dac05df-98dd-433e-8b60-a90ccd3d25b7.jpg"/>
-          <wp:cNvGraphicFramePr>
-            <a:graphicFrameLocks xmlns:a="http://schemas.openxmlformats.org/drawingml/2006/main" noChangeAspect="1"/>
-          </wp:cNvGraphicFramePr>
-          <a:graphic xmlns:a="http://schemas.openxmlformats.org/drawingml/2006/main">
-            <a:graphicData uri="http://schemas.openxmlformats.org/drawingml/2006/picture">
-              <pic:pic xmlns:pic="http://schemas.openxmlformats.org/drawingml/2006/picture">
-                <pic:nvPicPr>
-                  <pic:cNvPr id="0" name="Picture 430" descr="C:\Users\EUNICE\Desktop\5dac05df-98dd-433e-8b60-a90ccd3d25b7.jpg"/>
-                  <pic:cNvPicPr>
-                    <a:picLocks noChangeAspect="1" noChangeArrowheads="1"/>
-                  </pic:cNvPicPr>
-                </pic:nvPicPr>
-                <pic:blipFill>
-                  <a:blip r:embed="rId3" cstate="print">
-                    <a:extLst>
-                      <a:ext uri="{28A0092B-C50C-407E-A947-70E740481C1C}">
-                        <a14:useLocalDpi xmlns:a14="http://schemas.microsoft.com/office/drawing/2010/main" val="0"/>
-                      </a:ext>
-                    </a:extLst>
-                  </a:blip>
-                  <a:srcRect/>
-                  <a:stretch>
-                    <a:fillRect/>
-                  </a:stretch>
-                </pic:blipFill>
-                <pic:spPr bwMode="auto">
-                  <a:xfrm>
-                    <a:off x="0" y="0"/>
-                    <a:ext cx="1314450" cy="1314450"/>
-                  </a:xfrm>
-                  <a:prstGeom prst="rect">
-                    <a:avLst/>
-                  </a:prstGeom>
-                  <a:noFill/>
-                  <a:ln>
-                    <a:noFill/>
-                  </a:ln>
-                </pic:spPr>
-              </pic:pic>
-            </a:graphicData>
-          </a:graphic>
-          <wp14:sizeRelH relativeFrom="page">
-            <wp14:pctWidth>0</wp14:pctWidth>
-          </wp14:sizeRelH>
-          <wp14:sizeRelV relativeFrom="page">
-            <wp14:pctHeight>0</wp14:pctHeight>
-          </wp14:sizeRelV>
-        </wp:anchor>
-      </w:drawing>
-    </w:r>
-    <w:r>
-      <w:rPr>
-        <w:rFonts w:ascii="Verdana" w:hAnsi="Verdana"/>
-        <w:b/>
-        <w:u w:val="single"/>
-      </w:rPr>
-      <w:t>PREFEITURA MUNICIPAL DE SÃO JOÃO DE IRACEMA</w:t>
-    </w:r>
-  </w:p>
-  <w:p>
-    <w:pPr>
-      <w:jc w:val="center"/>
-      <w:rPr>
-        <w:rFonts w:ascii="Verdana" w:hAnsi="Verdana"/>
-        <w:b/>
-        <w:sz w:val="20"/>
-        <w:szCs w:val="20"/>
-        <w:u w:val="single"/>
-      </w:rPr>
-    </w:pPr>
-    <w:r>
-      <w:rPr>
-        <w:rFonts w:ascii="Verdana" w:hAnsi="Verdana"/>
-        <w:b/>
-        <w:sz w:val="20"/>
-        <w:szCs w:val="20"/>
-        <w:u w:val="single"/>
-      </w:rPr>
-      <w:t>SECRETARIA MUNICIPAL DE EDUCAÇÃO</w:t>
-    </w:r>
-  </w:p>
-  <w:p>
-    <w:pPr>
-      <w:jc w:val="center"/>
-      <w:rPr>
-        <w:rFonts w:ascii="Verdana" w:hAnsi="Verdana"/>
-        <w:b/>
-        <w:sz w:val="20"/>
-        <w:szCs w:val="20"/>
-        <w:u w:val="single"/>
-      </w:rPr>
-    </w:pPr>
-    <w:r>
-      <w:rPr>
-        <w:rFonts w:ascii="Verdana" w:hAnsi="Verdana"/>
-        <w:sz w:val="20"/>
-        <w:szCs w:val="20"/>
-      </w:rPr>
-      <w:t>DIRETORIA REGIONAL DE ENSINO REGIÃO DE FERNANDÓPOLIS</w:t>
-    </w:r>
-  </w:p>
-  <w:p>
-    <w:pPr>
-      <w:tabs>
-        <w:tab w:val="left" w:pos="735"/>
-        <w:tab w:val="center" w:pos="4200"/>
-      </w:tabs>
-      <w:jc w:val="center"/>
-      <w:rPr>
-        <w:rFonts w:ascii="Verdana" w:hAnsi="Verdana"/>
-        <w:b/>
-      </w:rPr>
-    </w:pPr>
-    <w:r>
-      <w:rPr>
-        <w:rFonts w:ascii="Verdana" w:hAnsi="Verdana"/>
-        <w:b/>
-      </w:rPr>
-      <w:t>EMEF   “ALFREDINA COELHO”</w:t>
-    </w:r>
-  </w:p>
-  <w:p>
-    <w:pPr>
-      <w:jc w:val="center"/>
-      <w:rPr>
-        <w:rFonts w:ascii="Verdana" w:hAnsi="Verdana"/>
-        <w:b/>
-        <w:sz w:val="20"/>
-        <w:szCs w:val="20"/>
-      </w:rPr>
-    </w:pPr>
-    <w:r>
-      <w:rPr>
-        <w:rFonts w:ascii="Arial" w:hAnsi="Arial" w:cs="Arial"/>
-        <w:b/>
-        <w:sz w:val="20"/>
-        <w:szCs w:val="20"/>
-      </w:rPr>
-      <w:t>CNPJ 59.764.728/0001-63</w:t>
-    </w:r>
-  </w:p>
-  <w:p>
-    <w:pPr>
-      <w:jc w:val="center"/>
-      <w:rPr>
-        <w:rFonts w:ascii="Arial" w:hAnsi="Arial" w:cs="Arial"/>
-        <w:b/>
-        <w:sz w:val="20"/>
-        <w:szCs w:val="20"/>
-      </w:rPr>
-    </w:pPr>
-    <w:r>
-      <w:rPr>
-        <w:rFonts w:ascii="Arial" w:hAnsi="Arial" w:cs="Arial"/>
-        <w:b/>
-        <w:sz w:val="20"/>
-        <w:szCs w:val="20"/>
-      </w:rPr>
-      <w:t>Rua Moisés Domingues Rodrigues N° 310 – Fone (17) 3875-6135</w:t>
-    </w:r>
-  </w:p>
-  <w:p>
-    <w:pPr>
-      <w:jc w:val="center"/>
-      <w:rPr>
-        <w:rFonts w:ascii="Arial" w:hAnsi="Arial" w:cs="Arial"/>
-        <w:b/>
-        <w:sz w:val="20"/>
-        <w:szCs w:val="20"/>
-      </w:rPr>
-    </w:pPr>
-    <w:r>
-      <w:rPr>
-        <w:rFonts w:ascii="Arial" w:hAnsi="Arial" w:cs="Arial"/>
-        <w:b/>
-        <w:sz w:val="20"/>
-        <w:szCs w:val="20"/>
-      </w:rPr>
-      <w:t>CEP 15315-000 – Centro – SÃO JOÃO DE IRACEMA – ESTADO DE SÃO PAULO</w:t>
-    </w:r>
-  </w:p>
-  <w:p>
-    <w:pPr>
-      <w:jc w:val="center"/>
-      <w:rPr>
-        <w:rFonts w:ascii="Arial" w:hAnsi="Arial" w:cs="Arial"/>
-        <w:sz w:val="20"/>
-        <w:szCs w:val="20"/>
-        <w:lang w:val="en-US"/>
-      </w:rPr>
-    </w:pPr>
-    <w:r>
-      <w:rPr>
-        <w:rFonts w:ascii="Arial" w:hAnsi="Arial" w:cs="Arial"/>
-        <w:sz w:val="20"/>
-        <w:szCs w:val="20"/>
-        <w:lang w:val="en-US"/>
-      </w:rPr>
-      <w:t xml:space="preserve">Email: </w:t>
-    </w:r>
-    <w:hyperlink r:id="rId4" w:history="1">
-      <w:r>
-        <w:rPr>
-          <w:rFonts w:ascii="Arial" w:hAnsi="Arial" w:cs="Arial"/>
+    <w:hyperlink r:id="rId3">
+      <w:r>
+        <w:rPr>
+          <w:b/>
+          <w:bCs/>
           <w:color w:val="0000FF"/>
-          <w:sz w:val="20"/>
-          <w:szCs w:val="20"/>
+          <w:sz w:val="16"/>
+          <w:szCs w:val="16"/>
           <w:u w:val="single"/>
-          <w:lang w:val="en-US"/>
-        </w:rPr>
-        <w:t>emef.sjiracema@yahoo.com.br</w:t>
+        </w:rPr>
+        <w:t>emefalfredinacoelho.sji@gmail.com</w:t>
       </w:r>
     </w:hyperlink>
   </w:p>
@@ -1263,16 +1310,23 @@
   <w:p>
     <w:pPr>
       <w:pStyle w:val="Cabealho"/>
-      <w:rPr>
-        <w:lang w:val="en-US"/>
-      </w:rPr>
+    </w:pPr>
+  </w:p>
+</w:hdr>
+</file>
+
+<file path=word/header3.xml><?xml version="1.0" encoding="utf-8"?>
+<w:hdr xmlns:wpc="http://schemas.microsoft.com/office/word/2010/wordprocessingCanvas" xmlns:cx="http://schemas.microsoft.com/office/drawing/2014/chartex" xmlns:cx1="http://schemas.microsoft.com/office/drawing/2015/9/8/chartex" xmlns:cx2="http://schemas.microsoft.com/office/drawing/2015/10/21/chartex" xmlns:cx3="http://schemas.microsoft.com/office/drawing/2016/5/9/chartex" xmlns:cx4="http://schemas.microsoft.com/office/drawing/2016/5/10/chartex" xmlns:cx5="http://schemas.microsoft.com/office/drawing/2016/5/11/chartex" xmlns:cx6="http://schemas.microsoft.com/office/drawing/2016/5/12/chartex" xmlns:cx7="http://schemas.microsoft.com/office/drawing/2016/5/13/chartex" xmlns:cx8="http://schemas.microsoft.com/office/drawing/2016/5/14/chartex" xmlns:mc="http://schemas.openxmlformats.org/markup-compatibility/2006" xmlns:aink="http://schemas.microsoft.com/office/drawing/2016/ink" xmlns:am3d="http://schemas.microsoft.com/office/drawing/2017/model3d" xmlns:o="urn:schemas-microsoft-com:office:office" xmlns:r="http://schemas.openxmlformats.org/officeDocument/2006/relationships" xmlns:m="http://schemas.openxmlformats.org/officeDocument/2006/math" xmlns:v="urn:schemas-microsoft-com:vml" xmlns:wp14="http://schemas.microsoft.com/office/word/2010/wordprocessingDrawing" xmlns:wp="http://schemas.openxmlformats.org/drawingml/2006/wordprocessingDrawing" xmlns:w10="urn:schemas-microsoft-com:office:word" xmlns:w="http://schemas.openxmlformats.org/wordprocessingml/2006/main" xmlns:w14="http://schemas.microsoft.com/office/word/2010/wordml" xmlns:w15="http://schemas.microsoft.com/office/word/2012/wordml" xmlns:w16cex="http://schemas.microsoft.com/office/word/2018/wordml/cex" xmlns:w16cid="http://schemas.microsoft.com/office/word/2016/wordml/cid" xmlns:w16="http://schemas.microsoft.com/office/word/2018/wordml" xmlns:w16sdtdh="http://schemas.microsoft.com/office/word/2020/wordml/sdtdatahash" xmlns:w16se="http://schemas.microsoft.com/office/word/2015/wordml/symex" xmlns:wpg="http://schemas.microsoft.com/office/word/2010/wordprocessingGroup" xmlns:wpi="http://schemas.microsoft.com/office/word/2010/wordprocessingInk" xmlns:wne="http://schemas.microsoft.com/office/word/2006/wordml" xmlns:wps="http://schemas.microsoft.com/office/word/2010/wordprocessingShape" mc:Ignorable="w14 w15 w16se w16cid w16 w16cex w16sdtdh wp14">
+  <w:p>
+    <w:pPr>
+      <w:pStyle w:val="Cabealho"/>
     </w:pPr>
   </w:p>
 </w:hdr>
 </file>
 
 <file path=word/numbering.xml><?xml version="1.0" encoding="utf-8"?>
-<w:numbering xmlns:wpc="http://schemas.microsoft.com/office/word/2010/wordprocessingCanvas" xmlns:cx="http://schemas.microsoft.com/office/drawing/2014/chartex" xmlns:cx1="http://schemas.microsoft.com/office/drawing/2015/9/8/chartex" xmlns:cx2="http://schemas.microsoft.com/office/drawing/2015/10/21/chartex" xmlns:cx3="http://schemas.microsoft.com/office/drawing/2016/5/9/chartex" xmlns:cx4="http://schemas.microsoft.com/office/drawing/2016/5/10/chartex" xmlns:cx5="http://schemas.microsoft.com/office/drawing/2016/5/11/chartex" xmlns:cx6="http://schemas.microsoft.com/office/drawing/2016/5/12/chartex" xmlns:cx7="http://schemas.microsoft.com/office/drawing/2016/5/13/chartex" xmlns:cx8="http://schemas.microsoft.com/office/drawing/2016/5/14/chartex" xmlns:mc="http://schemas.openxmlformats.org/markup-compatibility/2006" xmlns:aink="http://schemas.microsoft.com/office/drawing/2016/ink" xmlns:am3d="http://schemas.microsoft.com/office/drawing/2017/model3d" xmlns:o="urn:schemas-microsoft-com:office:office" xmlns:oel="http://schemas.microsoft.com/office/2019/extlst" xmlns:r="http://schemas.openxmlformats.org/officeDocument/2006/relationships" xmlns:m="http://schemas.openxmlformats.org/officeDocument/2006/math" xmlns:v="urn:schemas-microsoft-com:vml" xmlns:wp14="http://schemas.microsoft.com/office/word/2010/wordprocessingDrawing" xmlns:wp="http://schemas.openxmlformats.org/drawingml/2006/wordprocessingDrawing" xmlns:w10="urn:schemas-microsoft-com:office:word" xmlns:w="http://schemas.openxmlformats.org/wordprocessingml/2006/main" xmlns:w14="http://schemas.microsoft.com/office/word/2010/wordml" xmlns:w15="http://schemas.microsoft.com/office/word/2012/wordml" xmlns:w16cex="http://schemas.microsoft.com/office/word/2018/wordml/cex" xmlns:w16cid="http://schemas.microsoft.com/office/word/2016/wordml/cid" xmlns:w16="http://schemas.microsoft.com/office/word/2018/wordml" xmlns:w16du="http://schemas.microsoft.com/office/word/2023/wordml/word16du" xmlns:w16sdtdh="http://schemas.microsoft.com/office/word/2020/wordml/sdtdatahash" xmlns:w16sdtfl="http://schemas.microsoft.com/office/word/2024/wordml/sdtformatlock" xmlns:w16se="http://schemas.microsoft.com/office/word/2015/wordml/symex" xmlns:wpg="http://schemas.microsoft.com/office/word/2010/wordprocessingGroup" xmlns:wpi="http://schemas.microsoft.com/office/word/2010/wordprocessingInk" xmlns:wne="http://schemas.microsoft.com/office/word/2006/wordml" xmlns:wps="http://schemas.microsoft.com/office/word/2010/wordprocessingShape" mc:Ignorable="w14 w15 w16se w16cid w16 w16cex w16sdtdh w16sdtfl w16du wp14">
+<w:numbering xmlns:wpc="http://schemas.microsoft.com/office/word/2010/wordprocessingCanvas" xmlns:cx="http://schemas.microsoft.com/office/drawing/2014/chartex" xmlns:cx1="http://schemas.microsoft.com/office/drawing/2015/9/8/chartex" xmlns:cx2="http://schemas.microsoft.com/office/drawing/2015/10/21/chartex" xmlns:cx3="http://schemas.microsoft.com/office/drawing/2016/5/9/chartex" xmlns:cx4="http://schemas.microsoft.com/office/drawing/2016/5/10/chartex" xmlns:cx5="http://schemas.microsoft.com/office/drawing/2016/5/11/chartex" xmlns:cx6="http://schemas.microsoft.com/office/drawing/2016/5/12/chartex" xmlns:cx7="http://schemas.microsoft.com/office/drawing/2016/5/13/chartex" xmlns:cx8="http://schemas.microsoft.com/office/drawing/2016/5/14/chartex" xmlns:mc="http://schemas.openxmlformats.org/markup-compatibility/2006" xmlns:aink="http://schemas.microsoft.com/office/drawing/2016/ink" xmlns:am3d="http://schemas.microsoft.com/office/drawing/2017/model3d" xmlns:o="urn:schemas-microsoft-com:office:office" xmlns:r="http://schemas.openxmlformats.org/officeDocument/2006/relationships" xmlns:m="http://schemas.openxmlformats.org/officeDocument/2006/math" xmlns:v="urn:schemas-microsoft-com:vml" xmlns:wp14="http://schemas.microsoft.com/office/word/2010/wordprocessingDrawing" xmlns:wp="http://schemas.openxmlformats.org/drawingml/2006/wordprocessingDrawing" xmlns:w10="urn:schemas-microsoft-com:office:word" xmlns:w="http://schemas.openxmlformats.org/wordprocessingml/2006/main" xmlns:w14="http://schemas.microsoft.com/office/word/2010/wordml" xmlns:w15="http://schemas.microsoft.com/office/word/2012/wordml" xmlns:w16cex="http://schemas.microsoft.com/office/word/2018/wordml/cex" xmlns:w16cid="http://schemas.microsoft.com/office/word/2016/wordml/cid" xmlns:w16="http://schemas.microsoft.com/office/word/2018/wordml" xmlns:w16sdtdh="http://schemas.microsoft.com/office/word/2020/wordml/sdtdatahash" xmlns:w16se="http://schemas.microsoft.com/office/word/2015/wordml/symex" xmlns:wpg="http://schemas.microsoft.com/office/word/2010/wordprocessingGroup" xmlns:wpi="http://schemas.microsoft.com/office/word/2010/wordprocessingInk" xmlns:wne="http://schemas.microsoft.com/office/word/2006/wordml" xmlns:wps="http://schemas.microsoft.com/office/word/2010/wordprocessingShape" mc:Ignorable="w14 w15 w16se w16cid w16 w16cex w16sdtdh wp14">
   <w:abstractNum w:abstractNumId="0" w15:restartNumberingAfterBreak="0">
     <w:nsid w:val="7DE22D95"/>
     <w:multiLevelType w:val="hybridMultilevel"/>
@@ -1362,14 +1416,14 @@
       </w:pPr>
     </w:lvl>
   </w:abstractNum>
-  <w:num w:numId="1" w16cid:durableId="1044479793">
+  <w:num w:numId="1">
     <w:abstractNumId w:val="0"/>
   </w:num>
 </w:numbering>
 </file>
 
 <file path=word/styles.xml><?xml version="1.0" encoding="utf-8"?>
-<w:styles xmlns:mc="http://schemas.openxmlformats.org/markup-compatibility/2006" xmlns:r="http://schemas.openxmlformats.org/officeDocument/2006/relationships" xmlns:w="http://schemas.openxmlformats.org/wordprocessingml/2006/main" xmlns:w14="http://schemas.microsoft.com/office/word/2010/wordml" xmlns:w15="http://schemas.microsoft.com/office/word/2012/wordml" xmlns:w16cex="http://schemas.microsoft.com/office/word/2018/wordml/cex" xmlns:w16cid="http://schemas.microsoft.com/office/word/2016/wordml/cid" xmlns:w16="http://schemas.microsoft.com/office/word/2018/wordml" xmlns:w16du="http://schemas.microsoft.com/office/word/2023/wordml/word16du" xmlns:w16sdtdh="http://schemas.microsoft.com/office/word/2020/wordml/sdtdatahash" xmlns:w16sdtfl="http://schemas.microsoft.com/office/word/2024/wordml/sdtformatlock" xmlns:w16se="http://schemas.microsoft.com/office/word/2015/wordml/symex" mc:Ignorable="w14 w15 w16se w16cid w16 w16cex w16sdtdh w16sdtfl w16du">
+<w:styles xmlns:mc="http://schemas.openxmlformats.org/markup-compatibility/2006" xmlns:r="http://schemas.openxmlformats.org/officeDocument/2006/relationships" xmlns:w="http://schemas.openxmlformats.org/wordprocessingml/2006/main" xmlns:w14="http://schemas.microsoft.com/office/word/2010/wordml" xmlns:w15="http://schemas.microsoft.com/office/word/2012/wordml" xmlns:w16cex="http://schemas.microsoft.com/office/word/2018/wordml/cex" xmlns:w16cid="http://schemas.microsoft.com/office/word/2016/wordml/cid" xmlns:w16="http://schemas.microsoft.com/office/word/2018/wordml" xmlns:w16sdtdh="http://schemas.microsoft.com/office/word/2020/wordml/sdtdatahash" xmlns:w16se="http://schemas.microsoft.com/office/word/2015/wordml/symex" mc:Ignorable="w14 w15 w16se w16cid w16 w16cex w16sdtdh">
   <w:docDefaults>
     <w:rPrDefault>
       <w:rPr>

</xml_diff>